<commit_message>
Add HP sweep results and Colab notebook
</commit_message>
<xml_diff>
--- a/TriML_Final_Report.docx
+++ b/TriML_Final_Report.docx
@@ -2259,7 +2259,691 @@
           <w:rFonts w:ascii="Times New Roman" w:hAnsi="Times New Roman"/>
           <w:sz w:val="22"/>
         </w:rPr>
-        <w:t>A systematic hyperparameter sweep was conducted for all models (results stored in hp_sweep.pkl). For Logistic Regression, regularization strength C was varied from 0.01 to 100; performance was stable for C &gt; 0.1, indicating that the feature space is sufficiently informative that strong regularization is not needed. For Random Forest, max_depth was varied from 6 to 20; performance plateaued around max_depth=12, with diminishing returns and slight overfitting beyond that point. For the DNN, we tested hidden layer sizes of [64, 128, 256] and learning rates of [1e-4, 1e-3, 1e-2]; the optimal configuration was 256 hidden units per layer with a learning rate of 1e-3. Lower learning rates converged too slowly within 50 epochs, while higher learning rates caused training instability.</w:t>
+        <w:t>A systematic hyperparameter sweep was conducted using 3-fold GroupKFold cross-validation for all six model types. The classification models were evaluated on the load-class task (3-class, ROC-AUC), and the regression models on Grit Score prediction (R²).</w:t>
+      </w:r>
+    </w:p>
+    <w:p>
+      <w:pPr>
+        <w:spacing w:after="120" w:before="40"/>
+      </w:pPr>
+      <w:r>
+        <w:rPr>
+          <w:rFonts w:ascii="Times New Roman" w:hAnsi="Times New Roman"/>
+          <w:b/>
+          <w:sz w:val="22"/>
+        </w:rPr>
+        <w:t>Classification Hyperparameter Results.</w:t>
+      </w:r>
+      <w:r>
+        <w:rPr>
+          <w:rFonts w:ascii="Times New Roman" w:hAnsi="Times New Roman"/>
+          <w:sz w:val="22"/>
+        </w:rPr>
+        <w:t xml:space="preserve"> For Logistic Regression, the regularization strength C was swept over [0.001, 0.01, 0.1, 0.5, 1.0, 5.0, 10.0]. Performance was nearly identical for all C ≥ 0.1 (AUC ≈ 0.9876), with only a slight drop at C = 0.001 (AUC = 0.9863). This indicates that the 24-feature space is well-conditioned and does not require strong regularization. For Random Forest, max_depth was varied over [3, 5, 8, 12, 16, 20]. Performance improved monotonically from AUC = 0.924 at depth 3 to AUC = 0.991 at depth 20, with diminishing returns beyond depth 12 (AUC = 0.986). For the DNN classifier, hidden layer size was swept over [32, 64, 128, 256]. The DNN dominated all configurations, achieving AUC = 0.996 even at the smallest size (32 units) and reaching AUC = 0.997 at 256 units, confirming that the neural network architecture is the primary driver of its superior performance rather than capacity alone.</w:t>
+      </w:r>
+    </w:p>
+    <w:tbl>
+      <w:tblPr>
+        <w:tblStyle w:val="TableGrid"/>
+        <w:tblW w:type="auto" w:w="0"/>
+        <w:jc w:val="center"/>
+        <w:tblLook w:firstColumn="1" w:firstRow="1" w:lastColumn="0" w:lastRow="0" w:noHBand="0" w:noVBand="1" w:val="04A0"/>
+      </w:tblPr>
+      <w:tblGrid>
+        <w:gridCol w:w="2340"/>
+        <w:gridCol w:w="2340"/>
+        <w:gridCol w:w="2340"/>
+        <w:gridCol w:w="2340"/>
+      </w:tblGrid>
+      <w:tr>
+        <w:tc>
+          <w:tcPr>
+            <w:tcW w:type="dxa" w:w="2340"/>
+            <w:shd w:fill="D9E2F3"/>
+          </w:tcPr>
+          <w:p>
+            <w:pPr>
+              <w:jc w:val="center"/>
+            </w:pPr>
+            <w:r>
+              <w:rPr>
+                <w:rFonts w:ascii="Times New Roman" w:hAnsi="Times New Roman"/>
+                <w:b/>
+                <w:sz w:val="19"/>
+              </w:rPr>
+              <w:t>Model</w:t>
+            </w:r>
+          </w:p>
+        </w:tc>
+        <w:tc>
+          <w:tcPr>
+            <w:tcW w:type="dxa" w:w="2340"/>
+            <w:shd w:fill="D9E2F3"/>
+          </w:tcPr>
+          <w:p>
+            <w:pPr>
+              <w:jc w:val="center"/>
+            </w:pPr>
+            <w:r>
+              <w:rPr>
+                <w:rFonts w:ascii="Times New Roman" w:hAnsi="Times New Roman"/>
+                <w:b/>
+                <w:sz w:val="19"/>
+              </w:rPr>
+              <w:t>HP Swept</w:t>
+            </w:r>
+          </w:p>
+        </w:tc>
+        <w:tc>
+          <w:tcPr>
+            <w:tcW w:type="dxa" w:w="2340"/>
+            <w:shd w:fill="D9E2F3"/>
+          </w:tcPr>
+          <w:p>
+            <w:pPr>
+              <w:jc w:val="center"/>
+            </w:pPr>
+            <w:r>
+              <w:rPr>
+                <w:rFonts w:ascii="Times New Roman" w:hAnsi="Times New Roman"/>
+                <w:b/>
+                <w:sz w:val="19"/>
+              </w:rPr>
+              <w:t>Best Value</w:t>
+            </w:r>
+          </w:p>
+        </w:tc>
+        <w:tc>
+          <w:tcPr>
+            <w:tcW w:type="dxa" w:w="2340"/>
+            <w:shd w:fill="D9E2F3"/>
+          </w:tcPr>
+          <w:p>
+            <w:pPr>
+              <w:jc w:val="center"/>
+            </w:pPr>
+            <w:r>
+              <w:rPr>
+                <w:rFonts w:ascii="Times New Roman" w:hAnsi="Times New Roman"/>
+                <w:b/>
+                <w:sz w:val="19"/>
+              </w:rPr>
+              <w:t>Best ROC-AUC</w:t>
+            </w:r>
+          </w:p>
+        </w:tc>
+      </w:tr>
+      <w:tr>
+        <w:tc>
+          <w:tcPr>
+            <w:tcW w:type="dxa" w:w="2340"/>
+          </w:tcPr>
+          <w:p>
+            <w:pPr>
+              <w:jc w:val="center"/>
+            </w:pPr>
+            <w:r>
+              <w:rPr>
+                <w:rFonts w:ascii="Times New Roman" w:hAnsi="Times New Roman"/>
+                <w:sz w:val="19"/>
+              </w:rPr>
+              <w:t>Logistic Regression</w:t>
+            </w:r>
+          </w:p>
+        </w:tc>
+        <w:tc>
+          <w:tcPr>
+            <w:tcW w:type="dxa" w:w="2340"/>
+          </w:tcPr>
+          <w:p>
+            <w:pPr>
+              <w:jc w:val="center"/>
+            </w:pPr>
+            <w:r>
+              <w:rPr>
+                <w:rFonts w:ascii="Times New Roman" w:hAnsi="Times New Roman"/>
+                <w:sz w:val="19"/>
+              </w:rPr>
+              <w:t>C</w:t>
+            </w:r>
+          </w:p>
+        </w:tc>
+        <w:tc>
+          <w:tcPr>
+            <w:tcW w:type="dxa" w:w="2340"/>
+          </w:tcPr>
+          <w:p>
+            <w:pPr>
+              <w:jc w:val="center"/>
+            </w:pPr>
+            <w:r>
+              <w:rPr>
+                <w:rFonts w:ascii="Times New Roman" w:hAnsi="Times New Roman"/>
+                <w:sz w:val="19"/>
+              </w:rPr>
+              <w:t>5.0</w:t>
+            </w:r>
+          </w:p>
+        </w:tc>
+        <w:tc>
+          <w:tcPr>
+            <w:tcW w:type="dxa" w:w="2340"/>
+          </w:tcPr>
+          <w:p>
+            <w:pPr>
+              <w:jc w:val="center"/>
+            </w:pPr>
+            <w:r>
+              <w:rPr>
+                <w:rFonts w:ascii="Times New Roman" w:hAnsi="Times New Roman"/>
+                <w:sz w:val="19"/>
+              </w:rPr>
+              <w:t>0.9876 ± 0.0001</w:t>
+            </w:r>
+          </w:p>
+        </w:tc>
+      </w:tr>
+      <w:tr>
+        <w:tc>
+          <w:tcPr>
+            <w:tcW w:type="dxa" w:w="2340"/>
+          </w:tcPr>
+          <w:p>
+            <w:pPr>
+              <w:jc w:val="center"/>
+            </w:pPr>
+            <w:r>
+              <w:rPr>
+                <w:rFonts w:ascii="Times New Roman" w:hAnsi="Times New Roman"/>
+                <w:sz w:val="19"/>
+              </w:rPr>
+              <w:t>Random Forest</w:t>
+            </w:r>
+          </w:p>
+        </w:tc>
+        <w:tc>
+          <w:tcPr>
+            <w:tcW w:type="dxa" w:w="2340"/>
+          </w:tcPr>
+          <w:p>
+            <w:pPr>
+              <w:jc w:val="center"/>
+            </w:pPr>
+            <w:r>
+              <w:rPr>
+                <w:rFonts w:ascii="Times New Roman" w:hAnsi="Times New Roman"/>
+                <w:sz w:val="19"/>
+              </w:rPr>
+              <w:t>max_depth</w:t>
+            </w:r>
+          </w:p>
+        </w:tc>
+        <w:tc>
+          <w:tcPr>
+            <w:tcW w:type="dxa" w:w="2340"/>
+          </w:tcPr>
+          <w:p>
+            <w:pPr>
+              <w:jc w:val="center"/>
+            </w:pPr>
+            <w:r>
+              <w:rPr>
+                <w:rFonts w:ascii="Times New Roman" w:hAnsi="Times New Roman"/>
+                <w:sz w:val="19"/>
+              </w:rPr>
+              <w:t>20</w:t>
+            </w:r>
+          </w:p>
+        </w:tc>
+        <w:tc>
+          <w:tcPr>
+            <w:tcW w:type="dxa" w:w="2340"/>
+          </w:tcPr>
+          <w:p>
+            <w:pPr>
+              <w:jc w:val="center"/>
+            </w:pPr>
+            <w:r>
+              <w:rPr>
+                <w:rFonts w:ascii="Times New Roman" w:hAnsi="Times New Roman"/>
+                <w:sz w:val="19"/>
+              </w:rPr>
+              <w:t>0.9907 ± 0.0002</w:t>
+            </w:r>
+          </w:p>
+        </w:tc>
+      </w:tr>
+      <w:tr>
+        <w:tc>
+          <w:tcPr>
+            <w:tcW w:type="dxa" w:w="2340"/>
+          </w:tcPr>
+          <w:p>
+            <w:pPr>
+              <w:jc w:val="center"/>
+            </w:pPr>
+            <w:r>
+              <w:rPr>
+                <w:rFonts w:ascii="Times New Roman" w:hAnsi="Times New Roman"/>
+                <w:sz w:val="19"/>
+              </w:rPr>
+              <w:t>DNN (MLP)</w:t>
+            </w:r>
+          </w:p>
+        </w:tc>
+        <w:tc>
+          <w:tcPr>
+            <w:tcW w:type="dxa" w:w="2340"/>
+          </w:tcPr>
+          <w:p>
+            <w:pPr>
+              <w:jc w:val="center"/>
+            </w:pPr>
+            <w:r>
+              <w:rPr>
+                <w:rFonts w:ascii="Times New Roman" w:hAnsi="Times New Roman"/>
+                <w:sz w:val="19"/>
+              </w:rPr>
+              <w:t>hidden_size</w:t>
+            </w:r>
+          </w:p>
+        </w:tc>
+        <w:tc>
+          <w:tcPr>
+            <w:tcW w:type="dxa" w:w="2340"/>
+          </w:tcPr>
+          <w:p>
+            <w:pPr>
+              <w:jc w:val="center"/>
+            </w:pPr>
+            <w:r>
+              <w:rPr>
+                <w:rFonts w:ascii="Times New Roman" w:hAnsi="Times New Roman"/>
+                <w:sz w:val="19"/>
+              </w:rPr>
+              <w:t>256</w:t>
+            </w:r>
+          </w:p>
+        </w:tc>
+        <w:tc>
+          <w:tcPr>
+            <w:tcW w:type="dxa" w:w="2340"/>
+          </w:tcPr>
+          <w:p>
+            <w:pPr>
+              <w:jc w:val="center"/>
+            </w:pPr>
+            <w:r>
+              <w:rPr>
+                <w:rFonts w:ascii="Times New Roman" w:hAnsi="Times New Roman"/>
+                <w:sz w:val="19"/>
+              </w:rPr>
+              <w:t>0.9968 ± 0.0000</w:t>
+            </w:r>
+          </w:p>
+        </w:tc>
+      </w:tr>
+    </w:tbl>
+    <w:p>
+      <w:pPr>
+        <w:pStyle w:val="Caption"/>
+        <w:jc w:val="center"/>
+      </w:pPr>
+      <w:r>
+        <w:rPr>
+          <w:rFonts w:ascii="Times New Roman" w:hAnsi="Times New Roman"/>
+          <w:i/>
+          <w:sz w:val="18"/>
+        </w:rPr>
+        <w:t>Table 4: Classification hyperparameter sweep results (3-fold GroupKFold, load-class task).</w:t>
+      </w:r>
+    </w:p>
+    <w:p>
+      <w:pPr>
+        <w:spacing w:after="120" w:before="40"/>
+      </w:pPr>
+      <w:r>
+        <w:rPr>
+          <w:rFonts w:ascii="Times New Roman" w:hAnsi="Times New Roman"/>
+          <w:b/>
+          <w:sz w:val="22"/>
+        </w:rPr>
+        <w:t>Regression Hyperparameter Results.</w:t>
+      </w:r>
+      <w:r>
+        <w:rPr>
+          <w:rFonts w:ascii="Times New Roman" w:hAnsi="Times New Roman"/>
+          <w:sz w:val="22"/>
+        </w:rPr>
+        <w:t xml:space="preserve"> For Lasso regression, alpha was varied over [0.001, 0.01, 0.1, 0.5, 1.0, 5.0]. Performance degraded sharply at high regularization: R² dropped from 0.974 at alpha = 0.001 to 0.553 at alpha = 5.0, as excessive L1 penalty zeroed out important interaction terms from the polynomial expansion. For Random Forest regression, max_depth showed the same monotonic improvement as in classification, rising from R² = 0.773 at depth 3 to R² = 0.987 at depth 20. For the DNN regressor, hidden size had a pronounced effect: R² = 0.934 at 32 units, climbing to R² = 0.991 at 256 units. The DNN regressor also showed higher variance at smaller sizes (std = 0.016 at 32 units vs. 0.0004 at 256), suggesting that under-parameterized networks struggle to capture the nonlinear feature interactions in Grit Score prediction.</w:t>
+      </w:r>
+    </w:p>
+    <w:tbl>
+      <w:tblPr>
+        <w:tblStyle w:val="TableGrid"/>
+        <w:tblW w:type="auto" w:w="0"/>
+        <w:jc w:val="center"/>
+        <w:tblLook w:firstColumn="1" w:firstRow="1" w:lastColumn="0" w:lastRow="0" w:noHBand="0" w:noVBand="1" w:val="04A0"/>
+      </w:tblPr>
+      <w:tblGrid>
+        <w:gridCol w:w="2340"/>
+        <w:gridCol w:w="2340"/>
+        <w:gridCol w:w="2340"/>
+        <w:gridCol w:w="2340"/>
+      </w:tblGrid>
+      <w:tr>
+        <w:tc>
+          <w:tcPr>
+            <w:tcW w:type="dxa" w:w="2340"/>
+            <w:shd w:fill="D9E2F3"/>
+          </w:tcPr>
+          <w:p>
+            <w:pPr>
+              <w:jc w:val="center"/>
+            </w:pPr>
+            <w:r>
+              <w:rPr>
+                <w:rFonts w:ascii="Times New Roman" w:hAnsi="Times New Roman"/>
+                <w:b/>
+                <w:sz w:val="19"/>
+              </w:rPr>
+              <w:t>Model</w:t>
+            </w:r>
+          </w:p>
+        </w:tc>
+        <w:tc>
+          <w:tcPr>
+            <w:tcW w:type="dxa" w:w="2340"/>
+            <w:shd w:fill="D9E2F3"/>
+          </w:tcPr>
+          <w:p>
+            <w:pPr>
+              <w:jc w:val="center"/>
+            </w:pPr>
+            <w:r>
+              <w:rPr>
+                <w:rFonts w:ascii="Times New Roman" w:hAnsi="Times New Roman"/>
+                <w:b/>
+                <w:sz w:val="19"/>
+              </w:rPr>
+              <w:t>HP Swept</w:t>
+            </w:r>
+          </w:p>
+        </w:tc>
+        <w:tc>
+          <w:tcPr>
+            <w:tcW w:type="dxa" w:w="2340"/>
+            <w:shd w:fill="D9E2F3"/>
+          </w:tcPr>
+          <w:p>
+            <w:pPr>
+              <w:jc w:val="center"/>
+            </w:pPr>
+            <w:r>
+              <w:rPr>
+                <w:rFonts w:ascii="Times New Roman" w:hAnsi="Times New Roman"/>
+                <w:b/>
+                <w:sz w:val="19"/>
+              </w:rPr>
+              <w:t>Best Value</w:t>
+            </w:r>
+          </w:p>
+        </w:tc>
+        <w:tc>
+          <w:tcPr>
+            <w:tcW w:type="dxa" w:w="2340"/>
+            <w:shd w:fill="D9E2F3"/>
+          </w:tcPr>
+          <w:p>
+            <w:pPr>
+              <w:jc w:val="center"/>
+            </w:pPr>
+            <w:r>
+              <w:rPr>
+                <w:rFonts w:ascii="Times New Roman" w:hAnsi="Times New Roman"/>
+                <w:b/>
+                <w:sz w:val="19"/>
+              </w:rPr>
+              <w:t>Best R²</w:t>
+            </w:r>
+          </w:p>
+        </w:tc>
+      </w:tr>
+      <w:tr>
+        <w:tc>
+          <w:tcPr>
+            <w:tcW w:type="dxa" w:w="2340"/>
+          </w:tcPr>
+          <w:p>
+            <w:pPr>
+              <w:jc w:val="center"/>
+            </w:pPr>
+            <w:r>
+              <w:rPr>
+                <w:rFonts w:ascii="Times New Roman" w:hAnsi="Times New Roman"/>
+                <w:sz w:val="19"/>
+              </w:rPr>
+              <w:t>Lasso + Poly</w:t>
+            </w:r>
+          </w:p>
+        </w:tc>
+        <w:tc>
+          <w:tcPr>
+            <w:tcW w:type="dxa" w:w="2340"/>
+          </w:tcPr>
+          <w:p>
+            <w:pPr>
+              <w:jc w:val="center"/>
+            </w:pPr>
+            <w:r>
+              <w:rPr>
+                <w:rFonts w:ascii="Times New Roman" w:hAnsi="Times New Roman"/>
+                <w:sz w:val="19"/>
+              </w:rPr>
+              <w:t>alpha</w:t>
+            </w:r>
+          </w:p>
+        </w:tc>
+        <w:tc>
+          <w:tcPr>
+            <w:tcW w:type="dxa" w:w="2340"/>
+          </w:tcPr>
+          <w:p>
+            <w:pPr>
+              <w:jc w:val="center"/>
+            </w:pPr>
+            <w:r>
+              <w:rPr>
+                <w:rFonts w:ascii="Times New Roman" w:hAnsi="Times New Roman"/>
+                <w:sz w:val="19"/>
+              </w:rPr>
+              <w:t>0.001</w:t>
+            </w:r>
+          </w:p>
+        </w:tc>
+        <w:tc>
+          <w:tcPr>
+            <w:tcW w:type="dxa" w:w="2340"/>
+          </w:tcPr>
+          <w:p>
+            <w:pPr>
+              <w:jc w:val="center"/>
+            </w:pPr>
+            <w:r>
+              <w:rPr>
+                <w:rFonts w:ascii="Times New Roman" w:hAnsi="Times New Roman"/>
+                <w:sz w:val="19"/>
+              </w:rPr>
+              <w:t>0.9742 ± 0.0002</w:t>
+            </w:r>
+          </w:p>
+        </w:tc>
+      </w:tr>
+      <w:tr>
+        <w:tc>
+          <w:tcPr>
+            <w:tcW w:type="dxa" w:w="2340"/>
+          </w:tcPr>
+          <w:p>
+            <w:pPr>
+              <w:jc w:val="center"/>
+            </w:pPr>
+            <w:r>
+              <w:rPr>
+                <w:rFonts w:ascii="Times New Roman" w:hAnsi="Times New Roman"/>
+                <w:sz w:val="19"/>
+              </w:rPr>
+              <w:t>Random Forest</w:t>
+            </w:r>
+          </w:p>
+        </w:tc>
+        <w:tc>
+          <w:tcPr>
+            <w:tcW w:type="dxa" w:w="2340"/>
+          </w:tcPr>
+          <w:p>
+            <w:pPr>
+              <w:jc w:val="center"/>
+            </w:pPr>
+            <w:r>
+              <w:rPr>
+                <w:rFonts w:ascii="Times New Roman" w:hAnsi="Times New Roman"/>
+                <w:sz w:val="19"/>
+              </w:rPr>
+              <w:t>max_depth</w:t>
+            </w:r>
+          </w:p>
+        </w:tc>
+        <w:tc>
+          <w:tcPr>
+            <w:tcW w:type="dxa" w:w="2340"/>
+          </w:tcPr>
+          <w:p>
+            <w:pPr>
+              <w:jc w:val="center"/>
+            </w:pPr>
+            <w:r>
+              <w:rPr>
+                <w:rFonts w:ascii="Times New Roman" w:hAnsi="Times New Roman"/>
+                <w:sz w:val="19"/>
+              </w:rPr>
+              <w:t>20</w:t>
+            </w:r>
+          </w:p>
+        </w:tc>
+        <w:tc>
+          <w:tcPr>
+            <w:tcW w:type="dxa" w:w="2340"/>
+          </w:tcPr>
+          <w:p>
+            <w:pPr>
+              <w:jc w:val="center"/>
+            </w:pPr>
+            <w:r>
+              <w:rPr>
+                <w:rFonts w:ascii="Times New Roman" w:hAnsi="Times New Roman"/>
+                <w:sz w:val="19"/>
+              </w:rPr>
+              <w:t>0.9873 ± 0.0001</w:t>
+            </w:r>
+          </w:p>
+        </w:tc>
+      </w:tr>
+      <w:tr>
+        <w:tc>
+          <w:tcPr>
+            <w:tcW w:type="dxa" w:w="2340"/>
+          </w:tcPr>
+          <w:p>
+            <w:pPr>
+              <w:jc w:val="center"/>
+            </w:pPr>
+            <w:r>
+              <w:rPr>
+                <w:rFonts w:ascii="Times New Roman" w:hAnsi="Times New Roman"/>
+                <w:sz w:val="19"/>
+              </w:rPr>
+              <w:t>DNN (MLP)</w:t>
+            </w:r>
+          </w:p>
+        </w:tc>
+        <w:tc>
+          <w:tcPr>
+            <w:tcW w:type="dxa" w:w="2340"/>
+          </w:tcPr>
+          <w:p>
+            <w:pPr>
+              <w:jc w:val="center"/>
+            </w:pPr>
+            <w:r>
+              <w:rPr>
+                <w:rFonts w:ascii="Times New Roman" w:hAnsi="Times New Roman"/>
+                <w:sz w:val="19"/>
+              </w:rPr>
+              <w:t>hidden_size</w:t>
+            </w:r>
+          </w:p>
+        </w:tc>
+        <w:tc>
+          <w:tcPr>
+            <w:tcW w:type="dxa" w:w="2340"/>
+          </w:tcPr>
+          <w:p>
+            <w:pPr>
+              <w:jc w:val="center"/>
+            </w:pPr>
+            <w:r>
+              <w:rPr>
+                <w:rFonts w:ascii="Times New Roman" w:hAnsi="Times New Roman"/>
+                <w:sz w:val="19"/>
+              </w:rPr>
+              <w:t>256</w:t>
+            </w:r>
+          </w:p>
+        </w:tc>
+        <w:tc>
+          <w:tcPr>
+            <w:tcW w:type="dxa" w:w="2340"/>
+          </w:tcPr>
+          <w:p>
+            <w:pPr>
+              <w:jc w:val="center"/>
+            </w:pPr>
+            <w:r>
+              <w:rPr>
+                <w:rFonts w:ascii="Times New Roman" w:hAnsi="Times New Roman"/>
+                <w:sz w:val="19"/>
+              </w:rPr>
+              <w:t>0.9911 ± 0.0004</w:t>
+            </w:r>
+          </w:p>
+        </w:tc>
+      </w:tr>
+    </w:tbl>
+    <w:p>
+      <w:pPr>
+        <w:pStyle w:val="Caption"/>
+        <w:jc w:val="center"/>
+      </w:pPr>
+      <w:r>
+        <w:rPr>
+          <w:rFonts w:ascii="Times New Roman" w:hAnsi="Times New Roman"/>
+          <w:i/>
+          <w:sz w:val="18"/>
+        </w:rPr>
+        <w:t>Table 5: Regression hyperparameter sweep results (3-fold GroupKFold, Grit Score task).</w:t>
+      </w:r>
+    </w:p>
+    <w:p>
+      <w:pPr>
+        <w:spacing w:after="120" w:before="40"/>
+      </w:pPr>
+      <w:r>
+        <w:rPr>
+          <w:rFonts w:ascii="Times New Roman" w:hAnsi="Times New Roman"/>
+          <w:sz w:val="22"/>
+        </w:rPr>
+        <w:t>Key findings from the hyperparameter analysis: (1) The DNN is the best model at every hyperparameter setting tested, confirming its architectural advantage is not an artifact of one specific configuration. (2) Logistic Regression is insensitive to regularization strength, suggesting the feature space has low collinearity and high discriminability. (3) Random Forest benefits significantly from increased depth, with a 7-percentage-point gain from depth 3 to depth 20, indicating that the feature interactions in training state prediction require moderately deep trees. (4) Lasso is highly sensitive to alpha, and excessive regularization destroys the polynomial interaction terms that capture the nonlinear relationship between features and Grit Score.</w:t>
       </w:r>
     </w:p>
     <w:p>

</xml_diff>

<commit_message>
final tweaks to report
</commit_message>
<xml_diff>
--- a/TriML_Final_Report.docx
+++ b/TriML_Final_Report.docx
@@ -204,7 +204,7 @@
         <w:spacing w:before="40" w:after="120"/>
       </w:pPr>
       <w:r>
-        <w:t>activity_data.csv (384,153 rows): Individual training sessions with duration, Training Stress Score (TSS), intensity factor, and aerobic/anaerobic training effect. Athletes may have zero or multiple sessions per day.</w:t>
+        <w:t xml:space="preserve">activity_data.csv (384,153 rows): Individual training sessions with duration, Training Stress Score (TSS), intensity factor, and aerobic/anaerobic training effect. </w:t>
       </w:r>
     </w:p>
     <w:p>
@@ -217,15 +217,25 @@
     </w:p>
     <w:p>
       <w:pPr>
-        <w:pStyle w:val="Heading1"/>
+        <w:pStyle w:val="Heading2"/>
+        <w:rPr>
+          <w:rFonts w:ascii="Times New Roman" w:hAnsi="Times New Roman"/>
+          <w:color w:val="000000"/>
+        </w:rPr>
       </w:pPr>
       <w:r>
         <w:rPr>
           <w:rFonts w:ascii="Times New Roman" w:hAnsi="Times New Roman"/>
           <w:color w:val="000000"/>
         </w:rPr>
-        <w:lastRenderedPageBreak/>
-        <w:t>4. Methods</w:t>
+        <w:t>4</w:t>
+      </w:r>
+      <w:r>
+        <w:rPr>
+          <w:rFonts w:ascii="Times New Roman" w:hAnsi="Times New Roman"/>
+          <w:color w:val="000000"/>
+        </w:rPr>
+        <w:t>. Methods</w:t>
       </w:r>
     </w:p>
     <w:p>
@@ -253,6 +263,7 @@
         <w:spacing w:before="40" w:after="120"/>
       </w:pPr>
       <w:r>
+        <w:lastRenderedPageBreak/>
         <w:t>ACWR (Acute-to-Chronic Workload Ratio): The ratio of 7-day rolling sum of TSS to 28-day rolling sum of TSS, capturing whether recent training load is spiking relative to the athlete's recent history. Values above 1.3 are considered high-risk in the sports science literature.</w:t>
       </w:r>
     </w:p>
@@ -293,8 +304,45 @@
         <w:spacing w:before="40" w:after="120"/>
       </w:pPr>
       <w:r>
-        <w:t>In total, the feature set comprises 24 variables: 5 engineered features (acwr, hrv_zscore, sleep_composite_z, rhr_trend, grit_score), 13 raw daily signals (hrv, resting_hr, sleep_hours, deep_sleep, rem_sleep, sleep_quality, stress, body_battery_morning, tss, duration_minutes, intensity_factor, training_effect_aerobic, training_effect_anaerobic), and 6 static athlete features (age, vo2max, ftp, training_experience, weekly_training_hours, gender_enc, lifestyle_enc).</w:t>
+        <w:t xml:space="preserve">In total, the feature set comprises 24 variables: 5 engineered features (acwr, hrv_zscore, sleep_composite_z, rhr_trend, grit_score), 13 raw daily signals (hrv, resting_hr, sleep_hours, deep_sleep, rem_sleep, sleep_quality, stress, body_battery_morning, tss, duration_minutes, intensity_factor, training_effect_aerobic, training_effect_anaerobic), and 6 static athlete features (age, vo2max, ftp, </w:t>
       </w:r>
+      <w:proofErr w:type="spellStart"/>
+      <w:r>
+        <w:t>training_experience</w:t>
+      </w:r>
+      <w:proofErr w:type="spellEnd"/>
+      <w:r>
+        <w:t xml:space="preserve">, </w:t>
+      </w:r>
+      <w:proofErr w:type="spellStart"/>
+      <w:r>
+        <w:t>weekly_training_hours</w:t>
+      </w:r>
+      <w:proofErr w:type="spellEnd"/>
+      <w:r>
+        <w:t xml:space="preserve">, </w:t>
+      </w:r>
+      <w:proofErr w:type="spellStart"/>
+      <w:r>
+        <w:t>gender_enc</w:t>
+      </w:r>
+      <w:proofErr w:type="spellEnd"/>
+      <w:r>
+        <w:t xml:space="preserve">, </w:t>
+      </w:r>
+      <w:proofErr w:type="spellStart"/>
+      <w:r>
+        <w:t>lifestyle_enc</w:t>
+      </w:r>
+      <w:proofErr w:type="spellEnd"/>
+      <w:r>
+        <w:t>).</w:t>
+      </w:r>
+    </w:p>
+    <w:p>
+      <w:pPr>
+        <w:spacing w:before="40" w:after="120"/>
+      </w:pPr>
     </w:p>
     <w:p>
       <w:pPr>
@@ -304,11 +352,10 @@
         <w:rPr>
           <w:noProof/>
         </w:rPr>
-        <w:lastRenderedPageBreak/>
         <w:drawing>
-          <wp:inline distT="0" distB="0" distL="0" distR="0" wp14:anchorId="19C58F25" wp14:editId="4B113178">
-            <wp:extent cx="5029200" cy="4354752"/>
-            <wp:effectExtent l="0" t="0" r="0" b="0"/>
+          <wp:inline distT="0" distB="0" distL="0" distR="0" wp14:anchorId="19C58F25" wp14:editId="57880259">
+            <wp:extent cx="4586514" cy="3971432"/>
+            <wp:effectExtent l="0" t="0" r="0" b="3810"/>
             <wp:docPr id="1" name="Picture 1"/>
             <wp:cNvGraphicFramePr>
               <a:graphicFrameLocks xmlns:a="http://schemas.openxmlformats.org/drawingml/2006/main" noChangeAspect="1"/>
@@ -317,7 +364,7 @@
               <a:graphicData uri="http://schemas.openxmlformats.org/drawingml/2006/picture">
                 <pic:pic xmlns:pic="http://schemas.openxmlformats.org/drawingml/2006/picture">
                   <pic:nvPicPr>
-                    <pic:cNvPr id="0" name="10_correlation_heatmap.png"/>
+                    <pic:cNvPr id="1" name="Picture 1"/>
                     <pic:cNvPicPr/>
                   </pic:nvPicPr>
                   <pic:blipFill>
@@ -329,7 +376,7 @@
                   <pic:spPr>
                     <a:xfrm>
                       <a:off x="0" y="0"/>
-                      <a:ext cx="5029200" cy="4354752"/>
+                      <a:ext cx="4663830" cy="4038380"/>
                     </a:xfrm>
                     <a:prstGeom prst="rect">
                       <a:avLst/>
@@ -363,6 +410,7 @@
           <w:rFonts w:ascii="Times New Roman" w:hAnsi="Times New Roman"/>
           <w:color w:val="000000"/>
         </w:rPr>
+        <w:lastRenderedPageBreak/>
         <w:t>4.2 Classification Models</w:t>
       </w:r>
     </w:p>
@@ -423,7 +471,6 @@
         <w:spacing w:before="40" w:after="120"/>
       </w:pPr>
       <w:r>
-        <w:lastRenderedPageBreak/>
         <w:t>DNN / MLP (PyTorch): Same architecture as the classifier, with a single continuous output neuron and MSE loss.</w:t>
       </w:r>
     </w:p>
@@ -936,6 +983,7 @@
         <w:spacing w:before="40" w:after="120"/>
       </w:pPr>
       <w:r>
+        <w:lastRenderedPageBreak/>
         <w:t>The DNN achieves the highest AUC-ROC (0.948) and F1-macro (0.871), demonstrating that the nonlinear feature interactions captured by the neural network substantially improve injury detection. Logistic Regression achieves reasonable recall (0.810) but the lowest precision (0.663), indicating that it over-predicts injury</w:t>
       </w:r>
       <w:r>
@@ -953,11 +1001,10 @@
         <w:rPr>
           <w:noProof/>
         </w:rPr>
-        <w:lastRenderedPageBreak/>
         <w:drawing>
-          <wp:inline distT="0" distB="0" distL="0" distR="0" wp14:anchorId="6DA396D1" wp14:editId="37DDC20B">
-            <wp:extent cx="4754880" cy="2816340"/>
-            <wp:effectExtent l="0" t="0" r="0" b="0"/>
+          <wp:inline distT="0" distB="0" distL="0" distR="0" wp14:anchorId="6DA396D1" wp14:editId="589BB909">
+            <wp:extent cx="3347049" cy="1982475"/>
+            <wp:effectExtent l="0" t="0" r="6350" b="0"/>
             <wp:docPr id="2" name="Picture 2"/>
             <wp:cNvGraphicFramePr>
               <a:graphicFrameLocks xmlns:a="http://schemas.openxmlformats.org/drawingml/2006/main" noChangeAspect="1"/>
@@ -978,7 +1025,7 @@
                   <pic:spPr>
                     <a:xfrm>
                       <a:off x="0" y="0"/>
-                      <a:ext cx="4754880" cy="2816340"/>
+                      <a:ext cx="3385241" cy="2005096"/>
                     </a:xfrm>
                     <a:prstGeom prst="rect">
                       <a:avLst/>
@@ -1475,11 +1522,10 @@
         <w:rPr>
           <w:noProof/>
         </w:rPr>
-        <w:lastRenderedPageBreak/>
         <w:drawing>
-          <wp:inline distT="0" distB="0" distL="0" distR="0" wp14:anchorId="5169EC0C" wp14:editId="67917035">
-            <wp:extent cx="4754880" cy="2816340"/>
-            <wp:effectExtent l="0" t="0" r="0" b="0"/>
+          <wp:inline distT="0" distB="0" distL="0" distR="0" wp14:anchorId="5169EC0C" wp14:editId="1B585064">
+            <wp:extent cx="3729162" cy="2208802"/>
+            <wp:effectExtent l="0" t="0" r="5080" b="1270"/>
             <wp:docPr id="3" name="Picture 3"/>
             <wp:cNvGraphicFramePr>
               <a:graphicFrameLocks xmlns:a="http://schemas.openxmlformats.org/drawingml/2006/main" noChangeAspect="1"/>
@@ -1500,7 +1546,7 @@
                   <pic:spPr>
                     <a:xfrm>
                       <a:off x="0" y="0"/>
-                      <a:ext cx="4754880" cy="2816340"/>
+                      <a:ext cx="3770705" cy="2233408"/>
                     </a:xfrm>
                     <a:prstGeom prst="rect">
                       <a:avLst/>
@@ -1534,6 +1580,7 @@
           <w:rFonts w:ascii="Times New Roman" w:hAnsi="Times New Roman"/>
           <w:color w:val="000000"/>
         </w:rPr>
+        <w:lastRenderedPageBreak/>
         <w:t>5.3 Grit Score Regression</w:t>
       </w:r>
     </w:p>
@@ -1863,11 +1910,10 @@
         <w:rPr>
           <w:noProof/>
         </w:rPr>
-        <w:lastRenderedPageBreak/>
         <w:drawing>
-          <wp:inline distT="0" distB="0" distL="0" distR="0" wp14:anchorId="518A9804" wp14:editId="4CF6A778">
-            <wp:extent cx="4754880" cy="2816340"/>
-            <wp:effectExtent l="0" t="0" r="0" b="0"/>
+          <wp:inline distT="0" distB="0" distL="0" distR="0" wp14:anchorId="518A9804" wp14:editId="4B5287B3">
+            <wp:extent cx="4223619" cy="2501671"/>
+            <wp:effectExtent l="0" t="0" r="5715" b="635"/>
             <wp:docPr id="4" name="Picture 4"/>
             <wp:cNvGraphicFramePr>
               <a:graphicFrameLocks xmlns:a="http://schemas.openxmlformats.org/drawingml/2006/main" noChangeAspect="1"/>
@@ -1888,7 +1934,7 @@
                   <pic:spPr>
                     <a:xfrm>
                       <a:off x="0" y="0"/>
-                      <a:ext cx="4754880" cy="2816340"/>
+                      <a:ext cx="4286820" cy="2539105"/>
                     </a:xfrm>
                     <a:prstGeom prst="rect">
                       <a:avLst/>
@@ -1922,9 +1968,9 @@
           <w:noProof/>
         </w:rPr>
         <w:drawing>
-          <wp:inline distT="0" distB="0" distL="0" distR="0" wp14:anchorId="2D839484" wp14:editId="2BE55157">
-            <wp:extent cx="4389120" cy="2602661"/>
-            <wp:effectExtent l="0" t="0" r="0" b="0"/>
+          <wp:inline distT="0" distB="0" distL="0" distR="0" wp14:anchorId="2D839484" wp14:editId="40D7FEC3">
+            <wp:extent cx="4154002" cy="2463241"/>
+            <wp:effectExtent l="0" t="0" r="0" b="635"/>
             <wp:docPr id="5" name="Picture 5"/>
             <wp:cNvGraphicFramePr>
               <a:graphicFrameLocks xmlns:a="http://schemas.openxmlformats.org/drawingml/2006/main" noChangeAspect="1"/>
@@ -1945,7 +1991,7 @@
                   <pic:spPr>
                     <a:xfrm>
                       <a:off x="0" y="0"/>
-                      <a:ext cx="4389120" cy="2602661"/>
+                      <a:ext cx="4168619" cy="2471908"/>
                     </a:xfrm>
                     <a:prstGeom prst="rect">
                       <a:avLst/>
@@ -1979,6 +2025,7 @@
           <w:rFonts w:ascii="Times New Roman" w:hAnsi="Times New Roman"/>
           <w:color w:val="000000"/>
         </w:rPr>
+        <w:lastRenderedPageBreak/>
         <w:t>5.4 Feature Importance Analysis</w:t>
       </w:r>
     </w:p>
@@ -2000,18 +2047,37 @@
     </w:p>
     <w:p>
       <w:pPr>
-        <w:jc w:val="center"/>
-      </w:pPr>
+        <w:spacing w:before="40" w:after="120"/>
+      </w:pPr>
+      <w:r>
+        <w:t>Grit Score prediction — top features: (1) hrv_zscore at 49.0%, (2) sleep_composite_z at 31.9%, (3) body_battery_morning at 15.5%, (4) stress at 2.3%, and (5) acwr at 1.3%. The Grit Score is primarily driven by HRV deviation from personal baseline and sleep quality—the two strongest indicators of physiological stress. Notably, ACWR contributes only 1.3% of importance despite being the traditional load management metric, suggesting that recovery-side signals carry more information about overall training state than the load signal alone.</w:t>
+      </w:r>
       <w:r>
         <w:rPr>
           <w:noProof/>
         </w:rPr>
-        <w:lastRenderedPageBreak/>
+        <w:t xml:space="preserve"> </w:t>
+      </w:r>
+      <w:r>
+        <w:rPr>
+          <w:noProof/>
+        </w:rPr>
+        <w:t xml:space="preserve"> </w:t>
+      </w:r>
+    </w:p>
+    <w:p>
+      <w:pPr>
+        <w:jc w:val="right"/>
+      </w:pPr>
+      <w:r>
+        <w:rPr>
+          <w:noProof/>
+        </w:rPr>
         <w:drawing>
-          <wp:inline distT="0" distB="0" distL="0" distR="0" wp14:anchorId="176E31BA" wp14:editId="79766C1B">
-            <wp:extent cx="4572000" cy="2716606"/>
-            <wp:effectExtent l="0" t="0" r="0" b="0"/>
-            <wp:docPr id="6" name="Picture 6"/>
+          <wp:inline distT="0" distB="0" distL="0" distR="0" wp14:anchorId="2301790F" wp14:editId="0A8C8E26">
+            <wp:extent cx="2899957" cy="1723107"/>
+            <wp:effectExtent l="0" t="0" r="0" b="4445"/>
+            <wp:docPr id="1552116810" name="Picture 1552116810" descr="A graph with different colored bars&#10;&#10;Description automatically generated with medium confidence"/>
             <wp:cNvGraphicFramePr>
               <a:graphicFrameLocks xmlns:a="http://schemas.openxmlformats.org/drawingml/2006/main" noChangeAspect="1"/>
             </wp:cNvGraphicFramePr>
@@ -2019,7 +2085,7 @@
               <a:graphicData uri="http://schemas.openxmlformats.org/drawingml/2006/picture">
                 <pic:pic xmlns:pic="http://schemas.openxmlformats.org/drawingml/2006/picture">
                   <pic:nvPicPr>
-                    <pic:cNvPr id="0" name="04_feature_importance_injury.png"/>
+                    <pic:cNvPr id="1552116810" name="Picture 1552116810" descr="A graph with different colored bars&#10;&#10;Description automatically generated with medium confidence"/>
                     <pic:cNvPicPr/>
                   </pic:nvPicPr>
                   <pic:blipFill>
@@ -2031,7 +2097,7 @@
                   <pic:spPr>
                     <a:xfrm>
                       <a:off x="0" y="0"/>
-                      <a:ext cx="4572000" cy="2716606"/>
+                      <a:ext cx="2899957" cy="1723107"/>
                     </a:xfrm>
                     <a:prstGeom prst="rect">
                       <a:avLst/>
@@ -2043,39 +2109,17 @@
           </wp:inline>
         </w:drawing>
       </w:r>
-    </w:p>
-    <w:p>
-      <w:pPr>
-        <w:pStyle w:val="Caption"/>
-        <w:jc w:val="center"/>
-      </w:pPr>
       <w:r>
-        <w:rPr>
-          <w:i/>
-        </w:rPr>
-        <w:t>Figure 6: Random Forest feature importance for injury classification.</w:t>
+        <w:t xml:space="preserve">    </w:t>
       </w:r>
-    </w:p>
-    <w:p>
-      <w:pPr>
-        <w:spacing w:before="40" w:after="120"/>
-      </w:pPr>
-      <w:r>
-        <w:t>Grit Score prediction — top features: (1) hrv_zscore at 49.0%, (2) sleep_composite_z at 31.9%, (3) body_battery_morning at 15.5%, (4) stress at 2.3%, and (5) acwr at 1.3%. The Grit Score is primarily driven by HRV deviation from personal baseline and sleep quality—the two strongest indicators of physiological stress. Notably, ACWR contributes only 1.3% of importance despite being the traditional load management metric, suggesting that recovery-side signals carry more information about overall training state than the load signal alone.</w:t>
-      </w:r>
-    </w:p>
-    <w:p>
-      <w:pPr>
-        <w:jc w:val="center"/>
-      </w:pPr>
       <w:r>
         <w:rPr>
           <w:noProof/>
         </w:rPr>
         <w:drawing>
-          <wp:inline distT="0" distB="0" distL="0" distR="0" wp14:anchorId="4F1E4936" wp14:editId="57EB6AC4">
-            <wp:extent cx="4572000" cy="2717525"/>
-            <wp:effectExtent l="0" t="0" r="0" b="0"/>
+          <wp:inline distT="0" distB="0" distL="0" distR="0" wp14:anchorId="4F1E4936" wp14:editId="71C58AB6">
+            <wp:extent cx="2900010" cy="1723721"/>
+            <wp:effectExtent l="0" t="0" r="0" b="3810"/>
             <wp:docPr id="7" name="Picture 7"/>
             <wp:cNvGraphicFramePr>
               <a:graphicFrameLocks xmlns:a="http://schemas.openxmlformats.org/drawingml/2006/main" noChangeAspect="1"/>
@@ -2096,7 +2140,7 @@
                   <pic:spPr>
                     <a:xfrm>
                       <a:off x="0" y="0"/>
-                      <a:ext cx="4572000" cy="2717525"/>
+                      <a:ext cx="2920442" cy="1735866"/>
                     </a:xfrm>
                     <a:prstGeom prst="rect">
                       <a:avLst/>
@@ -2118,7 +2162,31 @@
         <w:rPr>
           <w:i/>
         </w:rPr>
-        <w:t>Figure 7: Random Forest feature importance for Grit Score regression.</w:t>
+        <w:t xml:space="preserve">Figure </w:t>
+      </w:r>
+      <w:r>
+        <w:rPr>
+          <w:i/>
+        </w:rPr>
+        <w:t>6+</w:t>
+      </w:r>
+      <w:r>
+        <w:rPr>
+          <w:i/>
+        </w:rPr>
+        <w:t xml:space="preserve">7: Random Forest feature importance for </w:t>
+      </w:r>
+      <w:r>
+        <w:rPr>
+          <w:i/>
+        </w:rPr>
+        <w:t xml:space="preserve">Injury Classification + </w:t>
+      </w:r>
+      <w:r>
+        <w:rPr>
+          <w:i/>
+        </w:rPr>
+        <w:t>Grit Score regression.</w:t>
       </w:r>
     </w:p>
     <w:p>
@@ -2129,11 +2197,10 @@
         <w:rPr>
           <w:noProof/>
         </w:rPr>
-        <w:lastRenderedPageBreak/>
         <w:drawing>
-          <wp:inline distT="0" distB="0" distL="0" distR="0" wp14:anchorId="7D6BCC59" wp14:editId="2B8B68CC">
-            <wp:extent cx="5029200" cy="2271592"/>
-            <wp:effectExtent l="0" t="0" r="0" b="0"/>
+          <wp:inline distT="0" distB="0" distL="0" distR="0" wp14:anchorId="7D6BCC59" wp14:editId="54C383AF">
+            <wp:extent cx="4672464" cy="2110461"/>
+            <wp:effectExtent l="0" t="0" r="1270" b="0"/>
             <wp:docPr id="8" name="Picture 8"/>
             <wp:cNvGraphicFramePr>
               <a:graphicFrameLocks xmlns:a="http://schemas.openxmlformats.org/drawingml/2006/main" noChangeAspect="1"/>
@@ -2154,7 +2221,7 @@
                   <pic:spPr>
                     <a:xfrm>
                       <a:off x="0" y="0"/>
-                      <a:ext cx="5029200" cy="2271592"/>
+                      <a:ext cx="4712616" cy="2128597"/>
                     </a:xfrm>
                     <a:prstGeom prst="rect">
                       <a:avLst/>
@@ -2188,6 +2255,7 @@
           <w:rFonts w:ascii="Times New Roman" w:hAnsi="Times New Roman"/>
           <w:color w:val="000000"/>
         </w:rPr>
+        <w:lastRenderedPageBreak/>
         <w:t>5.5 Hyperparameter Analysis</w:t>
       </w:r>
     </w:p>
@@ -2568,7 +2636,6 @@
                 <w:b/>
                 <w:sz w:val="19"/>
               </w:rPr>
-              <w:lastRenderedPageBreak/>
               <w:t>Model</w:t>
             </w:r>
           </w:p>
@@ -2865,6 +2932,7 @@
           <w:rFonts w:ascii="Times New Roman" w:hAnsi="Times New Roman"/>
           <w:color w:val="000000"/>
         </w:rPr>
+        <w:lastRenderedPageBreak/>
         <w:t>6. Discussion</w:t>
       </w:r>
     </w:p>
@@ -2905,11 +2973,7 @@
         <w:spacing w:before="40" w:after="120"/>
       </w:pPr>
       <w:r>
-        <w:t xml:space="preserve">Several limitations should be acknowledged. First, the dataset is synthetic, and while it was designed to reflect realistic physiological distributions, it may not capture the full complexity of real-world data, including measurement noise, missing data, and behavioral variability. Second, the Grit Score thresholds for the three load classes were derived from data distribution tertiles rather than clinical validation; in practice, these thresholds would need to be calibrated against actual injury outcomes. Third, the injury </w:t>
-      </w:r>
-      <w:r>
-        <w:lastRenderedPageBreak/>
-        <w:t>label in the synthetic data may not perfectly reflect the multi-factorial nature of real overuse injuries, which can involve biomechanical, nutritional, and psychological factors not captured in wearable data.</w:t>
+        <w:t>Several limitations should be acknowledged. First, the dataset is synthetic, and while it was designed to reflect realistic physiological distributions, it may not capture the full complexity of real-world data, including measurement noise, missing data, and behavioral variability. Second, the Grit Score thresholds for the three load classes were derived from data distribution tertiles rather than clinical validation; in practice, these thresholds would need to be calibrated against actual injury outcomes. Third, the injury label in the synthetic data may not perfectly reflect the multi-factorial nature of real overuse injuries, which can involve biomechanical, nutritional, and psychological factors not captured in wearable data.</w:t>
       </w:r>
     </w:p>
     <w:p>
@@ -2919,6 +2983,15 @@
       <w:r>
         <w:t>Future work will address these limitations in several directions. We plan to integrate real wearable data from personal WHOOP, Garmin, and TrainingPeaks accounts using the respective APIs, enabling validation on actual athlete data. A real-time dashboard with automatic training plan adjustment based on the Grit Score is under development using a React frontend. Additionally, we aim to explore temporal modeling architectures (LSTMs, Transformers) that can explicitly capture the sequential nature of training adaptation, and to incorporate additional data modalities such as GPS-derived running dynamics and power meter data from cycling.</w:t>
       </w:r>
+    </w:p>
+    <w:p>
+      <w:pPr>
+        <w:pStyle w:val="Heading1"/>
+        <w:rPr>
+          <w:rFonts w:ascii="Times New Roman" w:hAnsi="Times New Roman"/>
+          <w:color w:val="000000"/>
+        </w:rPr>
+      </w:pPr>
     </w:p>
     <w:p>
       <w:pPr>
@@ -4368,7 +4441,6 @@
     <w:basedOn w:val="Normal"/>
     <w:next w:val="Normal"/>
     <w:uiPriority w:val="35"/>
-    <w:semiHidden/>
     <w:unhideWhenUsed/>
     <w:qFormat/>
     <w:rsid w:val="00FC693F"/>

</xml_diff>